<commit_message>
Add references section (24th block) to AVM Morgan keynote speech doc
</commit_message>
<xml_diff>
--- a/documents_aug2026/AVM_MORGAN_SECURITY_KEYNOTE_SPEECH.docx
+++ b/documents_aug2026/AVM_MORGAN_SECURITY_KEYNOTE_SPEECH.docx
@@ -727,6 +727,32 @@
           <w:szCs w:val="24"/>
         </w:rPr>
         <w:t xml:space="preserve">I will not leave you with abstractions. In the next ninety days, we should create a North-Central Security Coordination Secretariat; establish a regional intelligence-fusion mechanism; map all major criminal and terrorist corridors; identify the one hundred most vulnerable communities; create community early-warning networks; establish rapid-response protocols; link governors' security councils digitally; institute common training for military, police, and liaison officers; establish a transparent regional security funding mechanism; and publish measurable security indicators every quarter.</w:t>
+      </w:r>
+    </w:p>
+    <w:p>
+      <w:pPr>
+        <w:spacing w:after="200" w:line="360"/>
+        <w:jc w:val="both"/>
+      </w:pPr>
+      <w:r>
+        <w:rPr>
+          <w:sz w:val="24"/>
+          <w:szCs w:val="24"/>
+        </w:rPr>
+        <w:t xml:space="preserve">REFERENCES</w:t>
+      </w:r>
+    </w:p>
+    <w:p>
+      <w:pPr>
+        <w:spacing w:after="200" w:line="360"/>
+        <w:jc w:val="both"/>
+      </w:pPr>
+      <w:r>
+        <w:rPr>
+          <w:sz w:val="24"/>
+          <w:szCs w:val="24"/>
+        </w:rPr>
+        <w:t xml:space="preserve">The historical and comparative examples cited throughout this address draw on the following sources and precedents: the Armed Conflict Location and Event Data Project (ACLED), for conflict and fatality data across Benue, Plateau, and Niger States, January 2024 to December 2025; the Northern Nigerian Security Trust Fund, inaugurated July 2026; Plan Colombia and the associated shift toward community intelligence and reintegration programmes in Colombia through the 1990s and 2000s; the Nyumba Kumi community policing initiative in Kenya; the Barangay Peacekeeping Action Teams of the Philippines; the Joint Terrorism Analysis Centre (JTAC) of the United Kingdom; the National Counterterrorism Center (NCTC) of the United States; the Multi-Agency Centre (MAC) of India, established following the 2008 Mumbai attacks; Israel's civil defence rapid-response and pre-positioning doctrine; youth reintegration programmes following the Good Friday Agreement in Northern Ireland; the ongoing provincial policing powers debate in South Africa; cross-border grazing and pastoralist dialogue initiatives across the Sahel, including the Kenya-Ethiopia grazing corridor agreements; and the North-Central Nigeria Governors' Forum joint security operations agreement of 2025.</w:t>
       </w:r>
     </w:p>
     <w:p>

</xml_diff>

<commit_message>
Move References to final/28th section per Tom's correction
</commit_message>
<xml_diff>
--- a/documents_aug2026/AVM_MORGAN_SECURITY_KEYNOTE_SPEECH.docx
+++ b/documents_aug2026/AVM_MORGAN_SECURITY_KEYNOTE_SPEECH.docx
@@ -731,32 +731,6 @@
     </w:p>
     <w:p>
       <w:pPr>
-        <w:spacing w:after="200" w:line="360"/>
-        <w:jc w:val="both"/>
-      </w:pPr>
-      <w:r>
-        <w:rPr>
-          <w:sz w:val="24"/>
-          <w:szCs w:val="24"/>
-        </w:rPr>
-        <w:t xml:space="preserve">REFERENCES</w:t>
-      </w:r>
-    </w:p>
-    <w:p>
-      <w:pPr>
-        <w:spacing w:after="200" w:line="360"/>
-        <w:jc w:val="both"/>
-      </w:pPr>
-      <w:r>
-        <w:rPr>
-          <w:sz w:val="24"/>
-          <w:szCs w:val="24"/>
-        </w:rPr>
-        <w:t xml:space="preserve">The historical and comparative examples cited throughout this address draw on the following sources and precedents: the Armed Conflict Location and Event Data Project (ACLED), for conflict and fatality data across Benue, Plateau, and Niger States, January 2024 to December 2025; the Northern Nigerian Security Trust Fund, inaugurated July 2026; Plan Colombia and the associated shift toward community intelligence and reintegration programmes in Colombia through the 1990s and 2000s; the Nyumba Kumi community policing initiative in Kenya; the Barangay Peacekeeping Action Teams of the Philippines; the Joint Terrorism Analysis Centre (JTAC) of the United Kingdom; the National Counterterrorism Center (NCTC) of the United States; the Multi-Agency Centre (MAC) of India, established following the 2008 Mumbai attacks; Israel's civil defence rapid-response and pre-positioning doctrine; youth reintegration programmes following the Good Friday Agreement in Northern Ireland; the ongoing provincial policing powers debate in South Africa; cross-border grazing and pastoralist dialogue initiatives across the Sahel, including the Kenya-Ethiopia grazing corridor agreements; and the North-Central Nigeria Governors' Forum joint security operations agreement of 2025.</w:t>
-      </w:r>
-    </w:p>
-    <w:p>
-      <w:pPr>
         <w:spacing w:after="100"/>
       </w:pPr>
     </w:p>
@@ -890,6 +864,32 @@
           <w:szCs w:val="22"/>
         </w:rPr>
         <w:t xml:space="preserve">— Air Vice Marshal Monday Riku Morgan (Rtd)</w:t>
+      </w:r>
+    </w:p>
+    <w:p>
+      <w:pPr>
+        <w:spacing w:after="200" w:line="360"/>
+        <w:jc w:val="both"/>
+      </w:pPr>
+      <w:r>
+        <w:rPr>
+          <w:sz w:val="24"/>
+          <w:szCs w:val="24"/>
+        </w:rPr>
+        <w:t xml:space="preserve">REFERENCES</w:t>
+      </w:r>
+    </w:p>
+    <w:p>
+      <w:pPr>
+        <w:spacing w:after="200" w:line="360"/>
+        <w:jc w:val="both"/>
+      </w:pPr>
+      <w:r>
+        <w:rPr>
+          <w:sz w:val="24"/>
+          <w:szCs w:val="24"/>
+        </w:rPr>
+        <w:t xml:space="preserve">The historical and comparative examples cited throughout this address draw on the following sources and precedents: the Armed Conflict Location and Event Data Project (ACLED), for conflict and fatality data across Benue, Plateau, and Niger States, January 2024 to December 2025; the Northern Nigerian Security Trust Fund, inaugurated July 2026; Plan Colombia and the associated shift toward community intelligence and reintegration programmes in Colombia through the 1990s and 2000s; the Nyumba Kumi community policing initiative in Kenya; the Barangay Peacekeeping Action Teams of the Philippines; the Joint Terrorism Analysis Centre (JTAC) of the United Kingdom; the National Counterterrorism Center (NCTC) of the United States; the Multi-Agency Centre (MAC) of India, established following the 2008 Mumbai attacks; Israel's civil defence rapid-response and pre-positioning doctrine; youth reintegration programmes following the Good Friday Agreement in Northern Ireland; the ongoing provincial policing powers debate in South Africa; cross-border grazing and pastoralist dialogue initiatives across the Sahel, including the Kenya-Ethiopia grazing corridor agreements; and the North-Central Nigeria Governors' Forum joint security operations agreement of 2025.</w:t>
       </w:r>
     </w:p>
     <w:sectPr>

</xml_diff>

<commit_message>
Replace opening intro with real casualty/displacement stats (Plateau Dec 2023, Mangu Jan 2024, Benue, Yelwata massacre); removed old contradictory opening line
</commit_message>
<xml_diff>
--- a/documents_aug2026/AVM_MORGAN_SECURITY_KEYNOTE_SPEECH.docx
+++ b/documents_aug2026/AVM_MORGAN_SECURITY_KEYNOTE_SPEECH.docx
@@ -90,11 +90,25 @@
         <w:jc w:val="both"/>
       </w:pPr>
       <w:r>
-        <w:rPr>
-          <w:sz w:val="24"/>
-          <w:szCs w:val="24"/>
-        </w:rPr>
-        <w:t xml:space="preserve">I want to begin not with statistics, but with people. A mother in Benue sending her children to school, wondering if they will return safely. A farmer in Plateau who fears that the next sound he hears may be gunfire, not birdsong. A traditional ruler in Niger State who watches armed men enter the forest at the edge of his domain, and does not know whom to call. A soldier redeployed again and again, without the intelligence or the mobility to prevent the next attack before it happens.</w:t>
+        <w:t>Nigeria's security architecture today sits at a genuine inflection point. Insurgency in the North-East has evolved and, in places, converged with banditry corridors further west and south. Farmer-herder conflict across the Middle Belt has intensified rather than eased over the past three years, and here in North-Central Nigeria we feel that intensification most directly.</w:t>
+      </w:r>
+    </w:p>
+    <w:p>
+      <w:pPr>
+        <w:spacing w:after="200" w:line="360"/>
+        <w:jc w:val="both"/>
+      </w:pPr>
+      <w:r>
+        <w:t>In December 2023, over one hundred and forty people were killed across more than seventeen rural communities in Plateau State in a single coordinated wave of Christmas Eve attacks. Barely a month later, in January 2024, at least thirty more people were killed in further attacks around Mangu town. This was not a one-off spike. Between May 2023 and May 2025, one thousand and forty-three people were killed in Benue State alone. And the single deadliest recent incident came on the night of the thirteenth and fourteenth of June 2025, when the Yelwata massacre in Guma Local Government Area of Benue State killed at least one hundred and fifty to one hundred and sixty people in one night — an incident so severe that Nigeria formally charged nine men with terrorism over it in February of this year, and one that moved even Pope Leo to publicly pray for the victims at his Sunday Angelus.</w:t>
+      </w:r>
+    </w:p>
+    <w:p>
+      <w:pPr>
+        <w:spacing w:after="200" w:line="360"/>
+        <w:jc w:val="both"/>
+      </w:pPr>
+      <w:r>
+        <w:t>The human cost compounds directly into displacement. As of the thirty-first of December 2024, five hundred thousand, one hundred and eighty-two people were already living in displacement camps in Benue State alone. By October 2025, North-Central and North-West Nigeria combined were hosting one million, three hundred and seventy-eight thousand, one hundred and twenty-four internally displaced persons. These are not abstract statistics. They are mothers, farmers, and traditional rulers — the very people I want this address to speak for.</w:t>
       </w:r>
     </w:p>
     <w:p>

</xml_diff>